<commit_message>
modified:   Third term/Programming of corporate systems/2.2/1.cs modified:   "Third term/Programming of corporate systems/2.2/\320\255\320\244\320\221\320\236-09-23 \320\232\320\260\320\273\320\270\320\275\320\270\320\275 \320\235. \320\222..docx" new file:   Third term/Programming of corporate systems/3.2/main.cs new file:   Third term/Programming of corporate systems/3.2/reservation.cs new file:   Third term/Programming of corporate systems/3.2/table.cs new file:   Third term/Programming of corporate systems/3/1.cs new file:   Third term/Programming of corporate systems/3/2.cs new file:   "Third term/Programming of corporate systems/3/\320\255\320\244\320\221\320\236-09-23 \320\232\320\260\320\273\320\270\320\275\320\270\320\275 \320\235. \320\222..docx"
</commit_message>
<xml_diff>
--- a/Third term/Programming of corporate systems/2.2/ЭФБО-09-23 Калинин Н. В..docx
+++ b/Third term/Programming of corporate systems/2.2/ЭФБО-09-23 Калинин Н. В..docx
@@ -940,6 +940,7 @@
               <w:rPr>
                 <w:sz w:val="28"/>
                 <w:szCs w:val="28"/>
+                <w:lang w:val="en-US"/>
               </w:rPr>
             </w:pPr>
             <w:r>
@@ -962,7 +963,60 @@
                 <w:sz w:val="28"/>
                 <w:szCs w:val="28"/>
               </w:rPr>
-              <w:t xml:space="preserve">, которое хранит длину массива. Например, получим длину массива </w:t>
+              <w:t>, которое хранит длину массива. Например</w:t>
+            </w:r>
+            <w:r>
+              <w:rPr>
+                <w:sz w:val="28"/>
+                <w:szCs w:val="28"/>
+                <w:lang w:val="en-US"/>
+              </w:rPr>
+              <w:t xml:space="preserve">, </w:t>
+            </w:r>
+            <w:r>
+              <w:rPr>
+                <w:sz w:val="28"/>
+                <w:szCs w:val="28"/>
+              </w:rPr>
+              <w:t>получим</w:t>
+            </w:r>
+            <w:r>
+              <w:rPr>
+                <w:sz w:val="28"/>
+                <w:szCs w:val="28"/>
+                <w:lang w:val="en-US"/>
+              </w:rPr>
+              <w:t xml:space="preserve"> </w:t>
+            </w:r>
+            <w:r>
+              <w:rPr>
+                <w:sz w:val="28"/>
+                <w:szCs w:val="28"/>
+              </w:rPr>
+              <w:t>длину</w:t>
+            </w:r>
+            <w:r>
+              <w:rPr>
+                <w:sz w:val="28"/>
+                <w:szCs w:val="28"/>
+                <w:lang w:val="en-US"/>
+              </w:rPr>
+              <w:t xml:space="preserve"> </w:t>
+            </w:r>
+            <w:r>
+              <w:rPr>
+                <w:sz w:val="28"/>
+                <w:szCs w:val="28"/>
+              </w:rPr>
+              <w:t>массива</w:t>
+            </w:r>
+            <w:r>
+              <w:rPr>
+                <w:sz w:val="28"/>
+                <w:szCs w:val="28"/>
+                <w:lang w:val="en-US"/>
+              </w:rPr>
+              <w:t xml:space="preserve"> </w:t>
             </w:r>
             <w:r>
               <w:rPr>
@@ -976,6 +1030,7 @@
               <w:rPr>
                 <w:sz w:val="28"/>
                 <w:szCs w:val="28"/>
+                <w:lang w:val="en-US"/>
               </w:rPr>
               <w:t>:</w:t>
             </w:r>
@@ -998,6 +1053,7 @@
                 <w:bCs/>
                 <w:sz w:val="28"/>
                 <w:szCs w:val="28"/>
+                <w:lang w:val="en-US"/>
               </w:rPr>
               <w:tab/>
             </w:r>
@@ -3755,9 +3811,9 @@
               </w:rPr>
               <w:drawing>
                 <wp:inline distT="0" distB="0" distL="0" distR="0">
-                  <wp:extent cx="5684520" cy="3695065"/>
-                  <wp:effectExtent l="0" t="0" r="5080" b="635"/>
-                  <wp:docPr id="2041641590" name="Picture 62"/>
+                  <wp:extent cx="5684520" cy="3799205"/>
+                  <wp:effectExtent l="0" t="0" r="5080" b="0"/>
+                  <wp:docPr id="1463795688" name="Picture 5"/>
                   <wp:cNvGraphicFramePr>
                     <a:graphicFrameLocks xmlns:a="http://schemas.openxmlformats.org/drawingml/2006/main" noChangeAspect="1"/>
                   </wp:cNvGraphicFramePr>
@@ -3765,7 +3821,7 @@
                     <a:graphicData uri="http://schemas.openxmlformats.org/drawingml/2006/picture">
                       <pic:pic xmlns:pic="http://schemas.openxmlformats.org/drawingml/2006/picture">
                         <pic:nvPicPr>
-                          <pic:cNvPr id="2041641590" name="Picture 2041641590"/>
+                          <pic:cNvPr id="1463795688" name="Picture 1463795688"/>
                           <pic:cNvPicPr/>
                         </pic:nvPicPr>
                         <pic:blipFill>
@@ -3783,7 +3839,7 @@
                         <pic:spPr>
                           <a:xfrm>
                             <a:off x="0" y="0"/>
-                            <a:ext cx="5684520" cy="3695065"/>
+                            <a:ext cx="5684520" cy="3799205"/>
                           </a:xfrm>
                           <a:prstGeom prst="rect">
                             <a:avLst/>

</xml_diff>